<commit_message>
hallazgos realizados 1.1.14,1.1.117 y 1.1.18
</commit_message>
<xml_diff>
--- a/fuentes/722103_CF25_DU.docx
+++ b/fuentes/722103_CF25_DU.docx
@@ -203,7 +203,7 @@
               </wp:anchor>
             </w:drawing>
           </mc:Choice>
-          <mc:Fallback xmlns:w16du="http://schemas.microsoft.com/office/word/2023/wordml/word16du" xmlns:oel="http://schemas.microsoft.com/office/2019/extlst">
+          <mc:Fallback xmlns:oel="http://schemas.microsoft.com/office/2019/extlst" xmlns:w16du="http://schemas.microsoft.com/office/word/2023/wordml/word16du">
             <w:pict>
               <v:rect w14:anchorId="04BF2410" id="Rectángulo 3" o:spid="_x0000_s1026" alt="&quot;&quot;" style="position:absolute;margin-left:-55.7pt;margin-top:26.5pt;width:613.85pt;height:204pt;z-index:-251655168;visibility:visible;mso-wrap-style:square;mso-height-percent:0;mso-wrap-distance-left:9pt;mso-wrap-distance-top:0;mso-wrap-distance-right:9pt;mso-wrap-distance-bottom:0;mso-position-horizontal:absolute;mso-position-horizontal-relative:text;mso-position-vertical:absolute;mso-position-vertical-relative:text;mso-height-percent:0;mso-height-relative:margin;v-text-anchor:middle" o:gfxdata="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" fillcolor="#00314d" stroked="f" strokeweight="1pt"/>
             </w:pict>
@@ -1730,23 +1730,7 @@
             <w:b/>
             <w:lang w:val="es-419"/>
           </w:rPr>
-          <w:t>Enlace de repro</w:t>
-        </w:r>
-        <w:r>
-          <w:rPr>
-            <w:rStyle w:val="Hipervnculo"/>
-            <w:b/>
-            <w:lang w:val="es-419"/>
-          </w:rPr>
-          <w:t>d</w:t>
-        </w:r>
-        <w:r>
-          <w:rPr>
-            <w:rStyle w:val="Hipervnculo"/>
-            <w:b/>
-            <w:lang w:val="es-419"/>
-          </w:rPr>
-          <w:t>ucción del video</w:t>
+          <w:t>Enlace de reproducción del video</w:t>
         </w:r>
       </w:hyperlink>
     </w:p>
@@ -5752,21 +5736,7 @@
         <w:rPr>
           <w:lang w:val="es-419" w:eastAsia="es-CO"/>
         </w:rPr>
-        <w:t xml:space="preserve">Otra forma de calcular la </w:t>
-      </w:r>
-      <w:proofErr w:type="gramStart"/>
-      <w:r>
-        <w:rPr>
-          <w:lang w:val="es-419" w:eastAsia="es-CO"/>
-        </w:rPr>
-        <w:t>TIR</w:t>
-      </w:r>
-      <w:proofErr w:type="gramEnd"/>
-      <w:r>
-        <w:rPr>
-          <w:lang w:val="es-419" w:eastAsia="es-CO"/>
-        </w:rPr>
-        <w:t xml:space="preserve"> pero esta vez en Excel es la siguiente, para este caso se trabaja otro ejemplo:</w:t>
+        <w:t>Otra forma de calcular la TIR pero esta vez en Excel es la siguiente, para este caso se trabaja otro ejemplo:</w:t>
       </w:r>
     </w:p>
     <w:p>
@@ -6230,21 +6200,7 @@
         <w:rPr>
           <w:lang w:val="es-419" w:eastAsia="es-CO"/>
         </w:rPr>
-        <w:t xml:space="preserve">inalmente, se le da </w:t>
-      </w:r>
-      <w:proofErr w:type="spellStart"/>
-      <w:r>
-        <w:rPr>
-          <w:lang w:val="es-419" w:eastAsia="es-CO"/>
-        </w:rPr>
-        <w:t>enter</w:t>
-      </w:r>
-      <w:proofErr w:type="spellEnd"/>
-      <w:r>
-        <w:rPr>
-          <w:lang w:val="es-419" w:eastAsia="es-CO"/>
-        </w:rPr>
-        <w:t xml:space="preserve"> y se obtiene el resultado correspondiente a la TIR, como se muestra en la siguiente figura</w:t>
+        <w:t>inalmente, se le da enter y se obtiene el resultado correspondiente a la TIR, como se muestra en la siguiente figura</w:t>
       </w:r>
       <w:r>
         <w:rPr>
@@ -6500,15 +6456,7 @@
           <w:bCs/>
           <w:lang w:val="es-419" w:eastAsia="es-CO"/>
         </w:rPr>
-        <w:t>¿Cómo c</w:t>
-      </w:r>
-      <w:r>
-        <w:rPr>
-          <w:b/>
-          <w:bCs/>
-          <w:lang w:val="es-419" w:eastAsia="es-CO"/>
-        </w:rPr>
-        <w:t xml:space="preserve">aso </w:t>
+        <w:t xml:space="preserve">¿Cómo </w:t>
       </w:r>
       <w:r>
         <w:rPr>
@@ -6748,21 +6696,7 @@
         <w:rPr>
           <w:lang w:val="es-419" w:eastAsia="es-CO"/>
         </w:rPr>
-        <w:t xml:space="preserve">e oprime la celda </w:t>
-      </w:r>
-      <w:proofErr w:type="spellStart"/>
-      <w:r>
-        <w:rPr>
-          <w:lang w:val="es-419" w:eastAsia="es-CO"/>
-        </w:rPr>
-        <w:t>enter</w:t>
-      </w:r>
-      <w:proofErr w:type="spellEnd"/>
-      <w:r>
-        <w:rPr>
-          <w:lang w:val="es-419" w:eastAsia="es-CO"/>
-        </w:rPr>
-        <w:t xml:space="preserve"> y se obtiene el resultado respectivo</w:t>
+        <w:t>e oprime la celda enter y se obtiene el resultado respectivo</w:t>
       </w:r>
       <w:r>
         <w:rPr>
@@ -6960,21 +6894,7 @@
         <w:rPr>
           <w:lang w:val="es-419" w:eastAsia="es-CO"/>
         </w:rPr>
-        <w:t xml:space="preserve">l darle </w:t>
-      </w:r>
-      <w:proofErr w:type="spellStart"/>
-      <w:r>
-        <w:rPr>
-          <w:lang w:val="es-419" w:eastAsia="es-CO"/>
-        </w:rPr>
-        <w:t>enter</w:t>
-      </w:r>
-      <w:proofErr w:type="spellEnd"/>
-      <w:r>
-        <w:rPr>
-          <w:lang w:val="es-419" w:eastAsia="es-CO"/>
-        </w:rPr>
-        <w:t xml:space="preserve"> se obtiene el valor del VNA de los </w:t>
+        <w:t xml:space="preserve">l darle enter se obtiene el valor del VNA de los </w:t>
       </w:r>
       <w:r>
         <w:rPr>
@@ -8909,19 +8829,9 @@
             <w:pPr>
               <w:pStyle w:val="TextoTablas"/>
             </w:pPr>
-            <w:proofErr w:type="spellStart"/>
-            <w:r>
-              <w:t>Leyson</w:t>
-            </w:r>
-            <w:proofErr w:type="spellEnd"/>
-            <w:r>
-              <w:t xml:space="preserve"> Fabian Castaño </w:t>
-            </w:r>
-            <w:proofErr w:type="spellStart"/>
-            <w:r>
-              <w:t>Perez</w:t>
-            </w:r>
-            <w:proofErr w:type="spellEnd"/>
+            <w:r>
+              <w:t>Leyson Fabian Castaño Perez</w:t>
+            </w:r>
           </w:p>
         </w:tc>
         <w:tc>
@@ -9209,7 +9119,6 @@
               </w:rPr>
               <w:t xml:space="preserve">Desarrollo </w:t>
             </w:r>
-            <w:proofErr w:type="spellStart"/>
             <w:r>
               <w:rPr>
                 <w:rStyle w:val="normaltextrun"/>
@@ -9232,7 +9141,6 @@
               </w:rPr>
               <w:t>ullstack</w:t>
             </w:r>
-            <w:proofErr w:type="spellEnd"/>
           </w:p>
         </w:tc>
         <w:tc>
@@ -9333,15 +9241,7 @@
               <w:pStyle w:val="TextoTablas"/>
             </w:pPr>
             <w:r>
-              <w:t xml:space="preserve">Luz </w:t>
-            </w:r>
-            <w:proofErr w:type="spellStart"/>
-            <w:r>
-              <w:t>Karime</w:t>
-            </w:r>
-            <w:proofErr w:type="spellEnd"/>
-            <w:r>
-              <w:t xml:space="preserve"> Amaya</w:t>
+              <w:t>Luz Karime Amaya</w:t>
             </w:r>
           </w:p>
         </w:tc>
@@ -9418,19 +9318,8 @@
                 <w:sz w:val="20"/>
                 <w:szCs w:val="20"/>
               </w:rPr>
-              <w:t xml:space="preserve">Jairo Valencia </w:t>
-            </w:r>
-            <w:proofErr w:type="spellStart"/>
-            <w:r>
-              <w:rPr>
-                <w:rFonts w:ascii="Arial" w:hAnsi="Arial" w:cs="Arial"/>
-                <w:color w:val="000000" w:themeColor="text1"/>
-                <w:sz w:val="20"/>
-                <w:szCs w:val="20"/>
-              </w:rPr>
-              <w:t>Ebrat</w:t>
-            </w:r>
-            <w:proofErr w:type="spellEnd"/>
+              <w:t>Jairo Valencia Ebrat</w:t>
+            </w:r>
           </w:p>
           <w:p>
             <w:pPr>
@@ -13444,6 +13333,10 @@
 </file>
 
 <file path=customXml/item1.xml><?xml version="1.0" encoding="utf-8"?>
+<b:Sources xmlns:b="http://schemas.openxmlformats.org/officeDocument/2006/bibliography" xmlns="http://schemas.openxmlformats.org/officeDocument/2006/bibliography" SelectedStyle="\APASixthEditionOfficeOnline.xsl" StyleName="APA" Version="6"/>
+</file>
+
+<file path=customXml/item2.xml><?xml version="1.0" encoding="utf-8"?>
 <?mso-contentType ?>
 <FormTemplates xmlns="http://schemas.microsoft.com/sharepoint/v3/contenttype/forms">
   <Display>DocumentLibraryForm</Display>
@@ -13452,11 +13345,18 @@
 </FormTemplates>
 </file>
 
-<file path=customXml/item2.xml><?xml version="1.0" encoding="utf-8"?>
-<b:Sources xmlns:b="http://schemas.openxmlformats.org/officeDocument/2006/bibliography" xmlns="http://schemas.openxmlformats.org/officeDocument/2006/bibliography" SelectedStyle="\APASixthEditionOfficeOnline.xsl" StyleName="APA" Version="6"/>
+<file path=customXml/item3.xml><?xml version="1.0" encoding="utf-8"?>
+<p:properties xmlns:p="http://schemas.microsoft.com/office/2006/metadata/properties" xmlns:xsi="http://www.w3.org/2001/XMLSchema-instance" xmlns:pc="http://schemas.microsoft.com/office/infopath/2007/PartnerControls">
+  <documentManagement>
+    <TaxCatchAll xmlns="cb45339b-ced9-4d0d-8f64-77573914d53b" xsi:nil="true"/>
+    <lcf76f155ced4ddcb4097134ff3c332f xmlns="43a3ca16-9c26-4813-b83f-4aec9927b43f">
+      <Terms xmlns="http://schemas.microsoft.com/office/infopath/2007/PartnerControls"/>
+    </lcf76f155ced4ddcb4097134ff3c332f>
+  </documentManagement>
+</p:properties>
 </file>
 
-<file path=customXml/item3.xml><?xml version="1.0" encoding="utf-8"?>
+<file path=customXml/item4.xml><?xml version="1.0" encoding="utf-8"?>
 <ct:contentTypeSchema xmlns:ct="http://schemas.microsoft.com/office/2006/metadata/contentType" xmlns:ma="http://schemas.microsoft.com/office/2006/metadata/properties/metaAttributes" ct:_="" ma:_="" ma:contentTypeName="Documento" ma:contentTypeID="0x01010049282E1EDBE9234EA9E6D38F720E265F" ma:contentTypeVersion="15" ma:contentTypeDescription="Crear nuevo documento." ma:contentTypeScope="" ma:versionID="b31c7aa9eaf043a08b87120b3c4916e3">
   <xsd:schema xmlns:xsd="http://www.w3.org/2001/XMLSchema" xmlns:xs="http://www.w3.org/2001/XMLSchema" xmlns:p="http://schemas.microsoft.com/office/2006/metadata/properties" xmlns:ns2="cb45339b-ced9-4d0d-8f64-77573914d53b" xmlns:ns3="43a3ca16-9c26-4813-b83f-4aec9927b43f" targetNamespace="http://schemas.microsoft.com/office/2006/metadata/properties" ma:root="true" ma:fieldsID="3533d065b04d75c457075bc55f1f5315" ns2:_="" ns3:_="">
     <xsd:import namespace="cb45339b-ced9-4d0d-8f64-77573914d53b"/>
@@ -13691,18 +13591,15 @@
 </ct:contentTypeSchema>
 </file>
 
-<file path=customXml/item4.xml><?xml version="1.0" encoding="utf-8"?>
-<p:properties xmlns:p="http://schemas.microsoft.com/office/2006/metadata/properties" xmlns:xsi="http://www.w3.org/2001/XMLSchema-instance" xmlns:pc="http://schemas.microsoft.com/office/infopath/2007/PartnerControls">
-  <documentManagement>
-    <TaxCatchAll xmlns="cb45339b-ced9-4d0d-8f64-77573914d53b" xsi:nil="true"/>
-    <lcf76f155ced4ddcb4097134ff3c332f xmlns="43a3ca16-9c26-4813-b83f-4aec9927b43f">
-      <Terms xmlns="http://schemas.microsoft.com/office/infopath/2007/PartnerControls"/>
-    </lcf76f155ced4ddcb4097134ff3c332f>
-  </documentManagement>
-</p:properties>
+<file path=customXml/itemProps1.xml><?xml version="1.0" encoding="utf-8"?>
+<ds:datastoreItem xmlns:ds="http://schemas.openxmlformats.org/officeDocument/2006/customXml" ds:itemID="{9072C9D3-7A62-4577-BF03-77C4F41797B5}">
+  <ds:schemaRefs>
+    <ds:schemaRef ds:uri="http://schemas.openxmlformats.org/officeDocument/2006/bibliography"/>
+  </ds:schemaRefs>
+</ds:datastoreItem>
 </file>
 
-<file path=customXml/itemProps1.xml><?xml version="1.0" encoding="utf-8"?>
+<file path=customXml/itemProps2.xml><?xml version="1.0" encoding="utf-8"?>
 <ds:datastoreItem xmlns:ds="http://schemas.openxmlformats.org/officeDocument/2006/customXml" ds:itemID="{81CBDEC1-3B00-44ED-AD36-0268077980BA}">
   <ds:schemaRefs>
     <ds:schemaRef ds:uri="http://schemas.microsoft.com/sharepoint/v3/contenttype/forms"/>
@@ -13710,15 +13607,18 @@
 </ds:datastoreItem>
 </file>
 
-<file path=customXml/itemProps2.xml><?xml version="1.0" encoding="utf-8"?>
-<ds:datastoreItem xmlns:ds="http://schemas.openxmlformats.org/officeDocument/2006/customXml" ds:itemID="{9072C9D3-7A62-4577-BF03-77C4F41797B5}">
+<file path=customXml/itemProps3.xml><?xml version="1.0" encoding="utf-8"?>
+<ds:datastoreItem xmlns:ds="http://schemas.openxmlformats.org/officeDocument/2006/customXml" ds:itemID="{6929C9FE-9F22-4B98-96EF-1B541B3BD0B2}">
   <ds:schemaRefs>
-    <ds:schemaRef ds:uri="http://schemas.openxmlformats.org/officeDocument/2006/bibliography"/>
+    <ds:schemaRef ds:uri="http://schemas.microsoft.com/office/2006/metadata/properties"/>
+    <ds:schemaRef ds:uri="http://schemas.microsoft.com/office/infopath/2007/PartnerControls"/>
+    <ds:schemaRef ds:uri="cb45339b-ced9-4d0d-8f64-77573914d53b"/>
+    <ds:schemaRef ds:uri="43a3ca16-9c26-4813-b83f-4aec9927b43f"/>
   </ds:schemaRefs>
 </ds:datastoreItem>
 </file>
 
-<file path=customXml/itemProps3.xml><?xml version="1.0" encoding="utf-8"?>
+<file path=customXml/itemProps4.xml><?xml version="1.0" encoding="utf-8"?>
 <ds:datastoreItem xmlns:ds="http://schemas.openxmlformats.org/officeDocument/2006/customXml" ds:itemID="{DF43E046-DB0C-42D1-8C73-AE38B52F1ED7}">
   <ds:schemaRefs>
     <ds:schemaRef ds:uri="http://schemas.microsoft.com/office/2006/metadata/contentType"/>
@@ -13735,15 +13635,4 @@
     <ds:schemaRef ds:uri="http://schemas.microsoft.com/internal/obd"/>
   </ds:schemaRefs>
 </ds:datastoreItem>
-</file>
-
-<file path=customXml/itemProps4.xml><?xml version="1.0" encoding="utf-8"?>
-<ds:datastoreItem xmlns:ds="http://schemas.openxmlformats.org/officeDocument/2006/customXml" ds:itemID="{6929C9FE-9F22-4B98-96EF-1B541B3BD0B2}">
-  <ds:schemaRefs>
-    <ds:schemaRef ds:uri="http://schemas.microsoft.com/office/2006/metadata/properties"/>
-    <ds:schemaRef ds:uri="http://schemas.microsoft.com/office/infopath/2007/PartnerControls"/>
-    <ds:schemaRef ds:uri="cb45339b-ced9-4d0d-8f64-77573914d53b"/>
-    <ds:schemaRef ds:uri="43a3ca16-9c26-4813-b83f-4aec9927b43f"/>
-  </ds:schemaRefs>
-</ds:datastoreItem>
 </file>
</xml_diff>